<commit_message>
Add vision artificial actividad 1
</commit_message>
<xml_diff>
--- a/Investigación y gestión/Actividad 1/Actividad 1.docx
+++ b/Investigación y gestión/Actividad 1/Actividad 1.docx
@@ -409,7 +409,11 @@
     <w:sdt>
       <w:sdtPr>
         <w:rPr>
-          <w:lang w:val="es-ES"/>
+          <w:rFonts w:asciiTheme="minorHAnsi" w:eastAsiaTheme="minorHAnsi" w:hAnsiTheme="minorHAnsi" w:cstheme="minorBidi"/>
+          <w:color w:val="auto"/>
+          <w:sz w:val="22"/>
+          <w:szCs w:val="22"/>
+          <w:lang w:val="es-ES" w:eastAsia="en-US"/>
         </w:rPr>
         <w:id w:val="1994986583"/>
         <w:docPartObj>
@@ -419,13 +423,8 @@
       </w:sdtPr>
       <w:sdtEndPr>
         <w:rPr>
-          <w:rFonts w:asciiTheme="minorHAnsi" w:eastAsiaTheme="minorHAnsi" w:hAnsiTheme="minorHAnsi" w:cstheme="minorBidi"/>
-          <w:b/>
-          <w:bCs/>
-          <w:color w:val="auto"/>
-          <w:sz w:val="22"/>
-          <w:szCs w:val="22"/>
-          <w:lang w:eastAsia="en-US"/>
+          <w:b/>
+          <w:bCs/>
         </w:rPr>
       </w:sdtEndPr>
       <w:sdtContent>
@@ -3875,23 +3874,7 @@
           <w:sz w:val="24"/>
           <w:szCs w:val="24"/>
         </w:rPr>
-        <w:t xml:space="preserve">Se debe obtener imágenes faciales de perros, donde </w:t>
-      </w:r>
-      <w:r>
-        <w:rPr>
-          <w:rFonts w:ascii="Times New Roman" w:hAnsi="Times New Roman" w:cs="Times New Roman"/>
-          <w:sz w:val="24"/>
-          <w:szCs w:val="24"/>
-        </w:rPr>
-        <w:t>la calidad de las imágenes debe</w:t>
-      </w:r>
-      <w:r>
-        <w:rPr>
-          <w:rFonts w:ascii="Times New Roman" w:hAnsi="Times New Roman" w:cs="Times New Roman"/>
-          <w:sz w:val="24"/>
-          <w:szCs w:val="24"/>
-        </w:rPr>
-        <w:t xml:space="preserve"> cumplir con requisitos cómo: diversidad de raza, edad, correcta iluminación y un correcto ángulo de captura (Guo et al., 2023).</w:t>
+        <w:t>Se debe obtener imágenes faciales de perros, donde la calidad de las imágenes debe cumplir con requisitos cómo: diversidad de raza, edad, correcta iluminación y un correcto ángulo de captura (Guo et al., 2023).</w:t>
       </w:r>
     </w:p>
     <w:p>
@@ -4914,6 +4897,40 @@
         </w:rPr>
         <w:br/>
         <w:t>• Evaluar la incorporación de biometría multimodal (rostro + hocico) para mejorar precisión (Kumar et al., 2020).</w:t>
+      </w:r>
+    </w:p>
+    <w:p>
+      <w:pPr>
+        <w:pStyle w:val="Ttulo1"/>
+      </w:pPr>
+      <w:r>
+        <w:t>Declaración de uso de IA</w:t>
+      </w:r>
+    </w:p>
+    <w:p>
+      <w:pPr>
+        <w:rPr>
+          <w:rFonts w:ascii="Times New Roman" w:hAnsi="Times New Roman" w:cs="Times New Roman"/>
+        </w:rPr>
+      </w:pPr>
+    </w:p>
+    <w:p>
+      <w:pPr>
+        <w:spacing w:line="360" w:lineRule="auto"/>
+        <w:jc w:val="both"/>
+        <w:rPr>
+          <w:rFonts w:ascii="Times New Roman" w:hAnsi="Times New Roman" w:cs="Times New Roman"/>
+          <w:sz w:val="24"/>
+          <w:szCs w:val="24"/>
+        </w:rPr>
+      </w:pPr>
+      <w:r>
+        <w:rPr>
+          <w:rFonts w:ascii="Times New Roman" w:hAnsi="Times New Roman" w:cs="Times New Roman"/>
+          <w:sz w:val="24"/>
+          <w:szCs w:val="24"/>
+        </w:rPr>
+        <w:t xml:space="preserve">Para este trabajo la IA se uso cómo apoyo a la búsqueda bibliografía con el fin de encontrar fuentes confiables y verídicas de forma rápida, en algunos casos la búsqueda fue errada por lo que tuve que buscar la información manualmente para poderla justificar. También se usó la IA cómo herramienta de Word para la corrección de gramática y sintaxis con el fin de poder presentar un documento limpio y entendible. </w:t>
       </w:r>
     </w:p>
     <w:p>
@@ -5640,6 +5657,7 @@
     </w:p>
     <w:p>
       <w:r>
+        <w:lastRenderedPageBreak/>
         <w:t xml:space="preserve">Cao, Q., Shen, L., Xie, W., Parkhi, O. M., &amp; </w:t>
       </w:r>
       <w:proofErr w:type="spellStart"/>
@@ -6101,7 +6119,6 @@
     </w:p>
     <w:p>
       <w:r>
-        <w:lastRenderedPageBreak/>
         <w:t xml:space="preserve">Barry, D. M., &amp; </w:t>
       </w:r>
       <w:proofErr w:type="spellStart"/>
@@ -6691,7 +6708,23 @@
           <w:i/>
           <w:iCs/>
         </w:rPr>
-        <w:t xml:space="preserve"> of Big Data, 6</w:t>
+        <w:t xml:space="preserve"> </w:t>
+      </w:r>
+      <w:proofErr w:type="spellStart"/>
+      <w:r>
+        <w:rPr>
+          <w:i/>
+          <w:iCs/>
+        </w:rPr>
+        <w:t>of</w:t>
+      </w:r>
+      <w:proofErr w:type="spellEnd"/>
+      <w:r>
+        <w:rPr>
+          <w:i/>
+          <w:iCs/>
+        </w:rPr>
+        <w:t xml:space="preserve"> Big Data, 6</w:t>
       </w:r>
       <w:r>
         <w:t>(60).</w:t>
@@ -9904,6 +9937,7 @@
   <w:style w:type="character" w:default="1" w:styleId="Fuentedeprrafopredeter">
     <w:name w:val="Default Paragraph Font"/>
     <w:uiPriority w:val="1"/>
+    <w:semiHidden/>
     <w:unhideWhenUsed/>
   </w:style>
   <w:style w:type="table" w:default="1" w:styleId="Tablanormal">

</xml_diff>